<commit_message>
Assistant Team Leader: QC work like a QA (scope=qc), QA hours entries; docs for ATL QC and SOP manage roles
Co-authored-by: Cursor <cursoragent@cursor.com>
</commit_message>
<xml_diff>
--- a/docs/handover/word/03 - Technical Reference.docx
+++ b/docs/handover/word/03 - Technical Reference.docx
@@ -667,7 +667,15 @@
         <w:pStyle w:val="ListBullet"/>
       </w:pPr>
       <w:r>
-        <w:t>SOP library: Admin, Super Admin, Project Manager, Assistant Manager can manage; everyone can view.</w:t>
+        <w:t>SOP library: Admin, Super Admin and Project Manager manage it from Manage &gt; SOPs; everyone else views it from the top menu.</w:t>
+      </w:r>
+    </w:p>
+    <w:p>
+      <w:pPr>
+        <w:pStyle w:val="ListBullet"/>
+      </w:pPr>
+      <w:r>
+        <w:t>Assistant Team Leader does QC like a QA when picked as an agent's QA: QC screens send scope = 'qc' so the backend filters by qa_id / project_qa_id instead of the team (routes/dropdown.py, tracker.py, user.py, qc_history_user_based.py); other screens stay team-based and view only.</w:t>
       </w:r>
     </w:p>
     <w:p>

</xml_diff>